<commit_message>
Economic Vibes — Wednesday, 05 August 2026 [auto]
</commit_message>
<xml_diff>
--- a/public/2026-08-05-Economic-Vibes-Morning-Brief.docx
+++ b/public/2026-08-05-Economic-Vibes-Morning-Brief.docx
@@ -253,7 +253,7 @@
         <w:pStyle w:val="BodyText"/>
       </w:pPr>
       <w:r>
-        <w:t xml:space="preserve">Warsh hold · Sept hike odds ~65%</w:t>
+        <w:t xml:space="preserve">Warsh hold · Sept hike odds rising</w:t>
       </w:r>
     </w:p>
     <w:p>
@@ -275,7 +275,7 @@
         <w:pStyle w:val="BodyText"/>
       </w:pPr>
       <w:r>
-        <w:t xml:space="preserve">$79.36 / $75.77</w:t>
+        <w:t xml:space="preserve">$78.87 / $76.50</w:t>
       </w:r>
     </w:p>
     <w:p>
@@ -305,15 +305,15 @@
         <w:pStyle w:val="BodyText"/>
       </w:pPr>
       <w:r>
-        <w:t xml:space="preserve">$4,075</w:t>
-      </w:r>
-    </w:p>
-    <w:p>
-      <w:pPr>
-        <w:pStyle w:val="BodyText"/>
-      </w:pPr>
-      <w:r>
-        <w:t xml:space="preserve">+0.5% · silver $58.63</w:t>
+        <w:t xml:space="preserve">$4,076</w:t>
+      </w:r>
+    </w:p>
+    <w:p>
+      <w:pPr>
+        <w:pStyle w:val="BodyText"/>
+      </w:pPr>
+      <w:r>
+        <w:t xml:space="preserve">+0.5% · silver $58.74</w:t>
       </w:r>
     </w:p>
     <w:p>
@@ -335,7 +335,7 @@
         <w:pStyle w:val="BodyText"/>
       </w:pPr>
       <w:r>
-        <w:t xml:space="preserve">279.00</w:t>
+        <w:t xml:space="preserve">278.25</w:t>
       </w:r>
     </w:p>
     <w:p>
@@ -346,7 +346,7 @@
         <w:t xml:space="preserve">interbank · steady</w:t>
       </w:r>
     </w:p>
-    <w:bookmarkStart w:id="29" w:name="X931b5a47ae4f286c693f0c27fa86217237ab988"/>
+    <w:bookmarkStart w:id="30" w:name="X931b5a47ae4f286c693f0c27fa86217237ab988"/>
     <w:p>
       <w:pPr>
         <w:pStyle w:val="Heading2"/>
@@ -383,7 +383,7 @@
           <w:bCs/>
           <w:b/>
         </w:rPr>
-        <w:t xml:space="preserve">S&amp;P 500 (+1.79%)</w:t>
+        <w:t xml:space="preserve">S&amp;P 500 (+1.79% to 7,736.52)</w:t>
       </w:r>
       <w:r>
         <w:t xml:space="preserve">,</w:t>
@@ -396,7 +396,7 @@
           <w:bCs/>
           <w:b/>
         </w:rPr>
-        <w:t xml:space="preserve">Dow (+1.71%, above 54,000 for the first time)</w:t>
+        <w:t xml:space="preserve">Dow (+1.71% to 54,085.88, above 54,000 for the first time)</w:t>
       </w:r>
       <w:r>
         <w:t xml:space="preserve"> </w:t>
@@ -412,7 +412,7 @@
           <w:bCs/>
           <w:b/>
         </w:rPr>
-        <w:t xml:space="preserve">Nasdaq (+2.59%)</w:t>
+        <w:t xml:space="preserve">Nasdaq (+2.59% to 26,584.99)</w:t>
       </w:r>
       <w:r>
         <w:t xml:space="preserve"> </w:t>
@@ -486,7 +486,7 @@
         <w:t xml:space="preserve"> </w:t>
       </w:r>
       <w:r>
-        <w:t xml:space="preserve">(−1,116.80 pts), giving back part of Monday's 1.20% surge as breadth turned negative — 161 advancers vs 295 decliners on 711.3m shares (Rs25.9bn) (</w:t>
+        <w:t xml:space="preserve">(−1,116.80 pts), giving back part of Monday's rally as institutional selling hit banks, E&amp;P and cement names — breadth turned negative at 161 advancers vs 295 decliners on 711.3m shares (Rs25.9bn) (</w:t>
       </w:r>
       <w:hyperlink r:id="rId22">
         <w:r>
@@ -542,7 +542,7 @@
           <w:bCs/>
           <w:b/>
         </w:rPr>
-        <w:t xml:space="preserve">Brent (−5.3% to $79.36)</w:t>
+        <w:t xml:space="preserve">Brent (−5.9% to $78.87)</w:t>
       </w:r>
       <w:r>
         <w:t xml:space="preserve"> </w:t>
@@ -558,20 +558,20 @@
           <w:bCs/>
           <w:b/>
         </w:rPr>
-        <w:t xml:space="preserve">WTI (−5.7% to $75.77)</w:t>
-      </w:r>
-      <w:r>
-        <w:t xml:space="preserve"> </w:t>
-      </w:r>
-      <w:r>
-        <w:t xml:space="preserve">tumbled as diplomacy hopes eased Strait of Hormuz supply risk, even as OPEC+ layered on 188,000 bpd of extra August supply (</w:t>
+        <w:t xml:space="preserve">WTI (down over 5%, trading $76.60–$82.32)</w:t>
+      </w:r>
+      <w:r>
+        <w:t xml:space="preserve"> </w:t>
+      </w:r>
+      <w:r>
+        <w:t xml:space="preserve">tumbled as diplomacy hopes eased Strait of Hormuz supply risk, even as seven OPEC+ producers layered on 188,000 bpd of extra August supply (</w:t>
       </w:r>
       <w:hyperlink r:id="rId24">
         <w:r>
           <w:rPr>
             <w:rStyle w:val="Hyperlink"/>
           </w:rPr>
-          <w:t xml:space="preserve">Rigzone</w:t>
+          <w:t xml:space="preserve">Trading Economics</w:t>
         </w:r>
       </w:hyperlink>
       <w:r>
@@ -620,7 +620,7 @@
           <w:bCs/>
           <w:b/>
         </w:rPr>
-        <w:t xml:space="preserve">Gold held near $4,075</w:t>
+        <w:t xml:space="preserve">Gold held near $4,076</w:t>
       </w:r>
       <w:r>
         <w:t xml:space="preserve"> </w:t>
@@ -636,13 +636,13 @@
           <w:bCs/>
           <w:b/>
         </w:rPr>
-        <w:t xml:space="preserve">silver near $58.63</w:t>
-      </w:r>
-      <w:r>
-        <w:t xml:space="preserve"> </w:t>
-      </w:r>
-      <w:r>
-        <w:t xml:space="preserve">as Fed Chair Kevin Warsh's hawkish-tinted 29 July hold left markets pricing roughly a 65% chance of a September</w:t>
+        <w:t xml:space="preserve">silver near $58.74</w:t>
+      </w:r>
+      <w:r>
+        <w:t xml:space="preserve"> </w:t>
+      </w:r>
+      <w:r>
+        <w:t xml:space="preserve">as Fed Chair Kevin Warsh's hawkish-tinted 29 July hold (FOMC voted 9-3 to stand pat) left markets pricing rising odds of a September</w:t>
       </w:r>
       <w:r>
         <w:t xml:space="preserve"> </w:t>
@@ -669,6 +669,20 @@
         </w:r>
       </w:hyperlink>
       <w:r>
+        <w:t xml:space="preserve">,</w:t>
+      </w:r>
+      <w:r>
+        <w:t xml:space="preserve"> </w:t>
+      </w:r>
+      <w:hyperlink r:id="rId27">
+        <w:r>
+          <w:rPr>
+            <w:rStyle w:val="Hyperlink"/>
+          </w:rPr>
+          <w:t xml:space="preserve">Trading Economics</w:t>
+        </w:r>
+      </w:hyperlink>
+      <w:r>
         <w:t xml:space="preserve">). Sentiment:</w:t>
       </w:r>
       <w:r>
@@ -722,9 +736,9 @@
         <w:t xml:space="preserve"> </w:t>
       </w:r>
       <w:r>
-        <w:t xml:space="preserve">for a second straight meeting, while Gulf non-oil PMIs (Saudi 53.1, UAE 55.8) stayed comfortably expansionary (</w:t>
-      </w:r>
-      <w:hyperlink r:id="rId27">
+        <w:t xml:space="preserve">for a second straight meeting, while Gulf non-oil PMIs (Saudi 53.1) stayed comfortably expansionary even as the UAE's cooled toward a multi-year low (</w:t>
+      </w:r>
+      <w:hyperlink r:id="rId28">
         <w:r>
           <w:rPr>
             <w:rStyle w:val="Hyperlink"/>
@@ -738,12 +752,12 @@
       <w:r>
         <w:t xml:space="preserve"> </w:t>
       </w:r>
-      <w:hyperlink r:id="rId28">
+      <w:hyperlink r:id="rId29">
         <w:r>
           <w:rPr>
             <w:rStyle w:val="Hyperlink"/>
           </w:rPr>
-          <w:t xml:space="preserve">AGBI</w:t>
+          <w:t xml:space="preserve">Semafor</w:t>
         </w:r>
       </w:hyperlink>
       <w:r>
@@ -759,8 +773,8 @@
         <w:t xml:space="preserve">.</w:t>
       </w:r>
     </w:p>
-    <w:bookmarkEnd w:id="29"/>
-    <w:bookmarkStart w:id="38" w:name="regional-market-economic-matrix"/>
+    <w:bookmarkEnd w:id="30"/>
+    <w:bookmarkStart w:id="39" w:name="regional-market-economic-matrix"/>
     <w:p>
       <w:pPr>
         <w:pStyle w:val="Heading2"/>
@@ -772,7 +786,7 @@
         <w:t xml:space="preserve">Regional Market &amp; Economic Matrix</w:t>
       </w:r>
     </w:p>
-    <w:bookmarkStart w:id="32" w:name="a.-local-market-pakistan-focus"/>
+    <w:bookmarkStart w:id="33" w:name="a.-local-market-pakistan-focus"/>
     <w:p>
       <w:pPr>
         <w:pStyle w:val="Heading3"/>
@@ -816,29 +830,12 @@
         </w:r>
       </w:hyperlink>
       <w:r>
-        <w:t xml:space="preserve">, shedding 1,116.80 points as institutional profit-taking followed Monday's 1.20% surge to 178,200.02. Breadth turned negative — 295 decliners against 161 advancers on 711.3 million shares (Rs25.9bn) — with</w:t>
-      </w:r>
-      <w:r>
-        <w:t xml:space="preserve"> </w:t>
-      </w:r>
-      <w:hyperlink r:id="rId23">
-        <w:r>
-          <w:rPr>
-            <w:rStyle w:val="Hyperlink"/>
-          </w:rPr>
-          <w:t xml:space="preserve">Trading Economics</w:t>
-        </w:r>
-      </w:hyperlink>
-      <w:r>
-        <w:t xml:space="preserve"> </w:t>
-      </w:r>
-      <w:r>
-        <w:t xml:space="preserve">confirming the pullback. Meezan Bank, PSO, Kapco, Power Cement and Millat Tractors added a combined 175 points, but UBL, Engro Holdings, OGDC, Lucky Cement and PPL erased 580 points on selective profit-taking in banks and E&amp;P names. On the macro front,</w:t>
-      </w:r>
-      <w:r>
-        <w:t xml:space="preserve"> </w:t>
-      </w:r>
-      <w:hyperlink r:id="rId27">
+        <w:t xml:space="preserve">, shedding 1,116.80 points as institutional profit-taking hit heavyweight sectors — commercial banks, oil &amp; gas exploration, cement and fertilizer — at elevated resistance levels. Breadth turned negative, with 295 decliners against 161 advancers (39 unchanged) on 711.3 million shares (Rs25.9bn); foreign investors were still net buyers to the tune of Rs166.3m. Meezan Bank, PSO, Kapco, Power Cement and Millat Tractors added a combined 175 points, but UBL, Engro Holdings, OGDC, Lucky Cement and PPL erased roughly 580 points on selective profit-taking. On the macro front,</w:t>
+      </w:r>
+      <w:r>
+        <w:t xml:space="preserve"> </w:t>
+      </w:r>
+      <w:hyperlink r:id="rId28">
         <w:r>
           <w:rPr>
             <w:rStyle w:val="Hyperlink"/>
@@ -850,24 +847,7 @@
         <w:t xml:space="preserve"> </w:t>
       </w:r>
       <w:r>
-        <w:t xml:space="preserve">from 11.1% in June, giving the</w:t>
-      </w:r>
-      <w:r>
-        <w:t xml:space="preserve"> </w:t>
-      </w:r>
-      <w:hyperlink r:id="rId30">
-        <w:r>
-          <w:rPr>
-            <w:rStyle w:val="Hyperlink"/>
-          </w:rPr>
-          <w:t xml:space="preserve">SBP room to hold its policy rate at 11.5%</w:t>
-        </w:r>
-      </w:hyperlink>
-      <w:r>
-        <w:t xml:space="preserve"> </w:t>
-      </w:r>
-      <w:r>
-        <w:t xml:space="preserve">for a second straight meeting. Six-month KIBOR is tracking near 11.70–11.90% (EST.). The</w:t>
+        <w:t xml:space="preserve">from 11.1% in June, giving the SBP room to</w:t>
       </w:r>
       <w:r>
         <w:t xml:space="preserve"> </w:t>
@@ -877,15 +857,32 @@
           <w:rPr>
             <w:rStyle w:val="Hyperlink"/>
           </w:rPr>
-          <w:t xml:space="preserve">IMF's Executive Board cleared the third EFF/RSF review in May</w:t>
+          <w:t xml:space="preserve">hold its policy rate at 11.5%</w:t>
         </w:r>
       </w:hyperlink>
       <w:r>
-        <w:t xml:space="preserve">, unlocking roughly $1.2bn; the next mission, likely covering an Article IV consultation, is expected in H2 2026.</w:t>
-      </w:r>
-    </w:p>
-    <w:bookmarkEnd w:id="32"/>
-    <w:bookmarkStart w:id="34" w:name="b.-gcc-middle-east"/>
+        <w:t xml:space="preserve"> </w:t>
+      </w:r>
+      <w:r>
+        <w:t xml:space="preserve">for a second straight meeting on 27 July. Six-month KIBOR is tracking near 11.70–11.90% (EST.), broadly in line with the policy rate. The</w:t>
+      </w:r>
+      <w:r>
+        <w:t xml:space="preserve"> </w:t>
+      </w:r>
+      <w:hyperlink r:id="rId32">
+        <w:r>
+          <w:rPr>
+            <w:rStyle w:val="Hyperlink"/>
+          </w:rPr>
+          <w:t xml:space="preserve">IMF's Executive Board cleared the third EFF/second RSF review on 8 May</w:t>
+        </w:r>
+      </w:hyperlink>
+      <w:r>
+        <w:t xml:space="preserve">, unlocking roughly $1.1bn (EFF) and $220m (RSF); the next review is expected in H2 2026.</w:t>
+      </w:r>
+    </w:p>
+    <w:bookmarkEnd w:id="33"/>
+    <w:bookmarkStart w:id="35" w:name="b.-gcc-middle-east"/>
     <w:p>
       <w:pPr>
         <w:pStyle w:val="Heading3"/>
@@ -913,7 +910,10 @@
         </w:r>
       </w:hyperlink>
       <w:r>
-        <w:t xml:space="preserve">, split across Saudi Arabia, Russia, Iraq, Kuwait, Kazakhstan, Algeria and Oman, continuing the unwind of 2023's voluntary cuts. That extra supply landed just as</w:t>
+        <w:t xml:space="preserve"> </w:t>
+      </w:r>
+      <w:r>
+        <w:t xml:space="preserve">— Saudi Arabia and Russia each contributing 62,000 bpd, with smaller increases from Iraq, Kuwait, Kazakhstan, Algeria and Oman — the fifth consecutive monthly increase as the group unwinds 2023's voluntary cuts. That extra supply landed just as</w:t>
       </w:r>
       <w:r>
         <w:t xml:space="preserve"> </w:t>
@@ -923,19 +923,16 @@
           <w:rPr>
             <w:rStyle w:val="Hyperlink"/>
           </w:rPr>
-          <w:t xml:space="preserve">Brent slid 5.3% to a three-week low of $79.36</w:t>
+          <w:t xml:space="preserve">Brent slid nearly 6% to $78.87</w:t>
         </w:r>
       </w:hyperlink>
       <w:r>
-        <w:t xml:space="preserve"> </w:t>
-      </w:r>
-      <w:r>
-        <w:t xml:space="preserve">on hopes for a reopened Strait of Hormuz — a double-barrelled bearish setup for crude that nonetheless keeps the Gulf's non-oil diversification story intact.</w:t>
-      </w:r>
-      <w:r>
-        <w:t xml:space="preserve"> </w:t>
-      </w:r>
-      <w:hyperlink r:id="rId33">
+        <w:t xml:space="preserve">, a three-week-plus low, on hopes for a reopened Strait of Hormuz — a double-barrelled bearish setup for crude that nonetheless keeps the Gulf's non-oil diversification story intact.</w:t>
+      </w:r>
+      <w:r>
+        <w:t xml:space="preserve"> </w:t>
+      </w:r>
+      <w:hyperlink r:id="rId34">
         <w:r>
           <w:rPr>
             <w:rStyle w:val="Hyperlink"/>
@@ -947,28 +944,28 @@
         <w:t xml:space="preserve"> </w:t>
       </w:r>
       <w:r>
-        <w:t xml:space="preserve">(53.3 in June), while the</w:t>
-      </w:r>
-      <w:r>
-        <w:t xml:space="preserve"> </w:t>
-      </w:r>
-      <w:hyperlink r:id="rId28">
+        <w:t xml:space="preserve">(53.3 in June) on firmer domestic demand, even as export orders fell for a fifth straight month on high freight costs. The</w:t>
+      </w:r>
+      <w:r>
+        <w:t xml:space="preserve"> </w:t>
+      </w:r>
+      <w:hyperlink r:id="rId29">
         <w:r>
           <w:rPr>
             <w:rStyle w:val="Hyperlink"/>
           </w:rPr>
-          <w:t xml:space="preserve">UAE's PMI eased to 55.8</w:t>
+          <w:t xml:space="preserve">UAE's non-oil private sector cooled toward its softest pace in several years</w:t>
         </w:r>
       </w:hyperlink>
       <w:r>
         <w:t xml:space="preserve"> </w:t>
       </w:r>
       <w:r>
-        <w:t xml:space="preserve">from 57.1 — its slowest pace in three months, though new export orders hit a three-year high as demand broadened across the GCC and Europe, a supportive signal for Vision 2030-linked non-oil diversification.</w:t>
-      </w:r>
-    </w:p>
-    <w:bookmarkEnd w:id="34"/>
-    <w:bookmarkStart w:id="37" w:name="c.-global-intelligence"/>
+        <w:t xml:space="preserve">(EST. low-51 handle) as regional disruptions weighed on new orders — a mixed but still-expansionary signal for Vision 2030-linked non-oil diversification and PIF-backed giga-projects.</w:t>
+      </w:r>
+    </w:p>
+    <w:bookmarkEnd w:id="35"/>
+    <w:bookmarkStart w:id="38" w:name="c.-global-intelligence"/>
     <w:p>
       <w:pPr>
         <w:pStyle w:val="Heading3"/>
@@ -1006,14 +1003,14 @@
           <w:rPr>
             <w:rStyle w:val="Hyperlink"/>
           </w:rPr>
-          <w:t xml:space="preserve">Dow added 907 points (+1.71%) to close above 54,000</w:t>
+          <w:t xml:space="preserve">Dow added 907.47 points (+1.71%) to close above 54,000</w:t>
         </w:r>
       </w:hyperlink>
       <w:r>
         <w:t xml:space="preserve"> </w:t>
       </w:r>
       <w:r>
-        <w:t xml:space="preserve">for the first time, and the Nasdaq surged 2.59% to 26,584.99, powered by a tech rebound, strong earnings, and easing US-Iran tensions over Hormuz. Bonds told a more cautious story: the 10-year yield sits near 4.63% and the 2-year at 4.21%, with</w:t>
+        <w:t xml:space="preserve">for the first time, and the Nasdaq surged 2.59% to 26,584.99, powered by a tech rebound, strong earnings and easing US-Iran tensions over Hormuz. Bonds told a more cautious story: the 10-year yield sits near 4.63% and the 2-year at 4.21%, with markets pricing rising odds the Fed</w:t>
       </w:r>
       <w:r>
         <w:t xml:space="preserve"> </w:t>
@@ -1023,19 +1020,19 @@
           <w:rPr>
             <w:rStyle w:val="Hyperlink"/>
           </w:rPr>
-          <w:t xml:space="preserve">markets pricing roughly a 65% chance the Fed hikes rather than cuts in September</w:t>
+          <w:t xml:space="preserve">hikes rather than cuts in September</w:t>
         </w:r>
       </w:hyperlink>
       <w:r>
         <w:t xml:space="preserve"> </w:t>
       </w:r>
       <w:r>
-        <w:t xml:space="preserve">after Chair Kevin Warsh's hawkish-sounding hold on 29 July rattled the inflation-credibility narrative. Separately, Washington's trade agenda intensified: a</w:t>
-      </w:r>
-      <w:r>
-        <w:t xml:space="preserve"> </w:t>
-      </w:r>
-      <w:hyperlink r:id="rId35">
+        <w:t xml:space="preserve">after Chair Kevin Warsh's FOMC voted 9-3 to hold on 29 July, a decision that has left his inflation-fighting credibility under scrutiny. Separately, Washington's trade agenda intensified: a</w:t>
+      </w:r>
+      <w:r>
+        <w:t xml:space="preserve"> </w:t>
+      </w:r>
+      <w:hyperlink r:id="rId36">
         <w:r>
           <w:rPr>
             <w:rStyle w:val="Hyperlink"/>
@@ -1052,7 +1049,7 @@
       <w:r>
         <w:t xml:space="preserve"> </w:t>
       </w:r>
-      <w:hyperlink r:id="rId36">
+      <w:hyperlink r:id="rId37">
         <w:r>
           <w:rPr>
             <w:rStyle w:val="Hyperlink"/>
@@ -1067,9 +1064,9 @@
         <w:t xml:space="preserve">that took effect 24 July.</w:t>
       </w:r>
     </w:p>
-    <w:bookmarkEnd w:id="37"/>
     <w:bookmarkEnd w:id="38"/>
-    <w:bookmarkStart w:id="42" w:name="X03555bbbc64501a448992dc5229870556a9c339"/>
+    <w:bookmarkEnd w:id="39"/>
+    <w:bookmarkStart w:id="44" w:name="X03555bbbc64501a448992dc5229870556a9c339"/>
     <w:p>
       <w:pPr>
         <w:pStyle w:val="Heading2"/>
@@ -1171,7 +1168,7 @@
               <w:pStyle w:val="Compact"/>
               <w:jc w:val="left"/>
             </w:pPr>
-            <w:hyperlink r:id="rId39">
+            <w:hyperlink r:id="rId40">
               <w:r>
                 <w:rPr>
                   <w:rStyle w:val="Hyperlink"/>
@@ -1183,7 +1180,21 @@
               <w:t xml:space="preserve"> </w:t>
             </w:r>
             <w:r>
-              <w:t xml:space="preserve">rolls out a 5% withholding tax on social media revenue and a National Faceless Center for algorithm-based tax audits/appeals, effective 1 July 2026.</w:t>
+              <w:t xml:space="preserve">imposed a 5% withholding tax (10% for non-filers) on digital content creators' social media earnings, effective 1 July;</w:t>
+            </w:r>
+            <w:r>
+              <w:t xml:space="preserve"> </w:t>
+            </w:r>
+            <w:hyperlink r:id="rId41">
+              <w:r>
+                <w:rPr>
+                  <w:rStyle w:val="Hyperlink"/>
+                </w:rPr>
+                <w:t xml:space="preserve">banks began deducting it at source from 30 July</w:t>
+              </w:r>
+            </w:hyperlink>
+            <w:r>
+              <w:t xml:space="preserve">.</w:t>
             </w:r>
           </w:p>
         </w:tc>
@@ -1195,7 +1206,7 @@
               <w:jc w:val="left"/>
             </w:pPr>
             <w:r>
-              <w:t xml:space="preserve">Tax/Compliance, Media, Retail</w:t>
+              <w:t xml:space="preserve">Media, Digital/Creator Economy, Retail</w:t>
             </w:r>
           </w:p>
         </w:tc>
@@ -1233,7 +1244,7 @@
               <w:t xml:space="preserve"> </w:t>
             </w:r>
             <w:r>
-              <w:t xml:space="preserve">social-media creators/platforms, cash-heavy informal retailers facing a tighter net.</w:t>
+              <w:t xml:space="preserve">social-media creators/influencers (especially non-filers facing a 10% deduction), platforms monetising Pakistani audiences.</w:t>
             </w:r>
           </w:p>
         </w:tc>
@@ -1262,7 +1273,7 @@
               <w:pStyle w:val="Compact"/>
               <w:jc w:val="left"/>
             </w:pPr>
-            <w:hyperlink r:id="rId40">
+            <w:hyperlink r:id="rId42">
               <w:r>
                 <w:rPr>
                   <w:rStyle w:val="Hyperlink"/>
@@ -1279,7 +1290,7 @@
             <w:r>
               <w:t xml:space="preserve"> </w:t>
             </w:r>
-            <w:hyperlink r:id="rId41">
+            <w:hyperlink r:id="rId43">
               <w:r>
                 <w:rPr>
                   <w:rStyle w:val="Hyperlink"/>
@@ -1376,7 +1387,7 @@
             <w:r>
               <w:t xml:space="preserve"> </w:t>
             </w:r>
-            <w:hyperlink r:id="rId35">
+            <w:hyperlink r:id="rId36">
               <w:r>
                 <w:rPr>
                   <w:rStyle w:val="Hyperlink"/>
@@ -1393,7 +1404,7 @@
             <w:r>
               <w:t xml:space="preserve"> </w:t>
             </w:r>
-            <w:hyperlink r:id="rId36">
+            <w:hyperlink r:id="rId37">
               <w:r>
                 <w:rPr>
                   <w:rStyle w:val="Hyperlink"/>
@@ -1461,8 +1472,8 @@
         </w:tc>
       </w:tr>
     </w:tbl>
-    <w:bookmarkEnd w:id="42"/>
-    <w:bookmarkStart w:id="43" w:name="the-day-ahead-kse-100-levels-desk-stance"/>
+    <w:bookmarkEnd w:id="44"/>
+    <w:bookmarkStart w:id="45" w:name="the-day-ahead-kse-100-levels-desk-stance"/>
     <w:p>
       <w:pPr>
         <w:pStyle w:val="Heading2"/>
@@ -1579,7 +1590,7 @@
         <w:t xml:space="preserve"> </w:t>
       </w:r>
       <w:r>
-        <w:t xml:space="preserve">Tuesday's pullback reads as profit-taking after a sharp two-session advance, not a trend reversal — breadth stayed negative (161 advancers vs 295 decliners) but large-cap banks and energy names absorbed most of the selling.</w:t>
+        <w:t xml:space="preserve">Tuesday's pullback reads as institutional profit-taking after a sharp advance, not a trend reversal — breadth stayed negative (161 advancers vs 295 decliners) but foreign flows remained net positive (Rs166.3m) and large-cap banks/energy names absorbed most of the selling.</w:t>
       </w:r>
       <w:r>
         <w:t xml:space="preserve"> </w:t>
@@ -1616,7 +1627,7 @@
         <w:t xml:space="preserve">Disclaimer: Produced by ContexAi for information and education only — not investment advice, a solicitation, or a guarantee. Trading securities, commodities and futures carries substantial risk of loss; leveraged futures can lose more than your margin. Levels are indicative. Consider your risk tolerance and consult a licensed financial adviser before acting. You alone are responsible for your trading decisions.</w:t>
       </w:r>
     </w:p>
-    <w:bookmarkEnd w:id="43"/>
+    <w:bookmarkEnd w:id="45"/>
     <w:sectPr/>
   </w:body>
 </w:document>

</xml_diff>